<commit_message>
Exam preparation problem 3 added
</commit_message>
<xml_diff>
--- a/FundamentalModule/Exam preparation/Exercise/Fundamentals-Final-Exam-Preparation-Problems-Description-1.docx
+++ b/FundamentalModule/Exam preparation/Exercise/Fundamentals-Final-Exam-Preparation-Problems-Description-1.docx
@@ -2182,15 +2182,7 @@
     </w:p>
     <w:p>
       <w:r>
-        <w:t xml:space="preserve">Next, you </w:t>
-      </w:r>
-      <w:proofErr w:type="gramStart"/>
-      <w:r>
-        <w:t>have to</w:t>
-      </w:r>
-      <w:proofErr w:type="gramEnd"/>
-      <w:r>
-        <w:t xml:space="preserve"> determine the </w:t>
+        <w:t xml:space="preserve">Next, you have to determine the </w:t>
       </w:r>
       <w:r>
         <w:rPr>
@@ -3181,7 +3173,21 @@
             <w:rStyle w:val="InternetLink"/>
             <w:lang w:val="bg-BG"/>
           </w:rPr>
-          <w:t>https://judge.softuni.org/Contests/Practice/Index/2302#2</w:t>
+          <w:t>https://judge.</w:t>
+        </w:r>
+        <w:r>
+          <w:rPr>
+            <w:rStyle w:val="InternetLink"/>
+            <w:lang w:val="bg-BG"/>
+          </w:rPr>
+          <w:t>s</w:t>
+        </w:r>
+        <w:r>
+          <w:rPr>
+            <w:rStyle w:val="InternetLink"/>
+            <w:lang w:val="bg-BG"/>
+          </w:rPr>
+          <w:t>oftuni.org/Contests/Practice/Index/2302#2</w:t>
         </w:r>
       </w:hyperlink>
       <w:r>
@@ -3219,23 +3225,7 @@
           <w:lang w:val="en-GB"/>
         </w:rPr>
         <w:lastRenderedPageBreak/>
-        <w:t xml:space="preserve">gold and treasure… and the occasional killing, of course. Go ahead, target some wealthy </w:t>
-      </w:r>
-      <w:proofErr w:type="gramStart"/>
-      <w:r>
-        <w:rPr>
-          <w:i/>
-          <w:lang w:val="en-GB"/>
-        </w:rPr>
-        <w:t>settlements</w:t>
-      </w:r>
-      <w:proofErr w:type="gramEnd"/>
-      <w:r>
-        <w:rPr>
-          <w:i/>
-          <w:lang w:val="en-GB"/>
-        </w:rPr>
-        <w:t xml:space="preserve"> and show them the pirate's way!</w:t>
+        <w:t>gold and treasure… and the occasional killing, of course. Go ahead, target some wealthy settlements and show them the pirate's way!</w:t>
       </w:r>
     </w:p>
     <w:p>
@@ -3316,15 +3306,7 @@
         </w:numPr>
       </w:pPr>
       <w:r>
-        <w:t xml:space="preserve">If you receive a city that has already been received, you </w:t>
-      </w:r>
-      <w:proofErr w:type="gramStart"/>
-      <w:r>
-        <w:t>have to</w:t>
-      </w:r>
-      <w:proofErr w:type="gramEnd"/>
-      <w:r>
-        <w:t xml:space="preserve"> increase the population and gold with the given values.</w:t>
+        <w:t>If you receive a city that has already been received, you have to increase the population and gold with the given values.</w:t>
       </w:r>
     </w:p>
     <w:p>
@@ -3444,7 +3426,21 @@
         </w:numPr>
       </w:pPr>
       <w:r>
-        <w:t xml:space="preserve">If any of those two values (population or gold) </w:t>
+        <w:t>If any of those two values (</w:t>
+      </w:r>
+      <w:proofErr w:type="spellStart"/>
+      <w:r>
+        <w:t>populat</w:t>
+      </w:r>
+      <w:r>
+        <w:t>x</w:t>
+      </w:r>
+      <w:r>
+        <w:t>ion</w:t>
+      </w:r>
+      <w:proofErr w:type="spellEnd"/>
+      <w:r>
+        <w:t xml:space="preserve"> or gold) </w:t>
       </w:r>
       <w:r>
         <w:rPr>

</xml_diff>